<commit_message>
Novas alteracoes e programas de verificacao
</commit_message>
<xml_diff>
--- a/Rodadas e Classificação Brasileirão Série A 2026.docx
+++ b/Rodadas e Classificação Brasileirão Série A 2026.docx
@@ -107,13 +107,7 @@
     <w:p/>
     <w:p>
       <w:r>
-        <w:t>2</w:t>
-      </w:r>
-      <w:r>
-        <w:t>9</w:t>
-      </w:r>
-      <w:r>
-        <w:t xml:space="preserve">/01/2026 – </w:t>
+        <w:t xml:space="preserve">29/01/2026 – </w:t>
       </w:r>
       <w:proofErr w:type="spellStart"/>
       <w:r>
@@ -125,7 +119,6 @@
       </w:r>
     </w:p>
     <w:p>
-      <w:bookmarkStart w:id="0" w:name="_GoBack"/>
       <w:r>
         <w:rPr>
           <w:noProof/>
@@ -173,8 +166,15 @@
           </wp:inline>
         </w:drawing>
       </w:r>
-      <w:bookmarkEnd w:id="0"/>
-    </w:p>
+    </w:p>
+    <w:p/>
+    <w:p/>
+    <w:p/>
+    <w:p/>
+    <w:p/>
+    <w:p/>
+    <w:p/>
+    <w:p/>
     <w:p>
       <w:r>
         <w:rPr>
@@ -224,8 +224,596 @@
         </w:drawing>
       </w:r>
     </w:p>
+    <w:p/>
+    <w:p/>
+    <w:p/>
+    <w:p/>
+    <w:p/>
+    <w:p/>
+    <w:p/>
+    <w:p/>
+    <w:p>
+      <w:r>
+        <w:lastRenderedPageBreak/>
+        <w:t>0</w:t>
+      </w:r>
+      <w:r>
+        <w:t>4/0</w:t>
+      </w:r>
+      <w:r>
+        <w:t>2</w:t>
+      </w:r>
+      <w:r>
+        <w:t xml:space="preserve">/2026 – </w:t>
+      </w:r>
+      <w:proofErr w:type="spellStart"/>
+      <w:r>
+        <w:t>Rodada</w:t>
+      </w:r>
+      <w:proofErr w:type="spellEnd"/>
+      <w:r>
+        <w:t xml:space="preserve"> 2</w:t>
+      </w:r>
+    </w:p>
+    <w:p>
+      <w:r>
+        <w:rPr>
+          <w:noProof/>
+        </w:rPr>
+        <w:drawing>
+          <wp:inline distT="0" distB="0" distL="0" distR="0" wp14:anchorId="718A34FC" wp14:editId="4ADC4A9C">
+            <wp:extent cx="6858000" cy="6416040"/>
+            <wp:effectExtent l="0" t="0" r="0" b="3810"/>
+            <wp:docPr id="5" name="Imagem 5" descr="Uma imagem contendo Tabela&#10;&#10;Descrição gerada automaticamente"/>
+            <wp:cNvGraphicFramePr>
+              <a:graphicFrameLocks xmlns:a="http://schemas.openxmlformats.org/drawingml/2006/main" noChangeAspect="1"/>
+            </wp:cNvGraphicFramePr>
+            <a:graphic xmlns:a="http://schemas.openxmlformats.org/drawingml/2006/main">
+              <a:graphicData uri="http://schemas.openxmlformats.org/drawingml/2006/picture">
+                <pic:pic xmlns:pic="http://schemas.openxmlformats.org/drawingml/2006/picture">
+                  <pic:nvPicPr>
+                    <pic:cNvPr id="5" name="Brasileirao_g1_rodada2_04fev26.jpeg"/>
+                    <pic:cNvPicPr/>
+                  </pic:nvPicPr>
+                  <pic:blipFill>
+                    <a:blip r:embed="rId10">
+                      <a:extLst>
+                        <a:ext uri="{28A0092B-C50C-407E-A947-70E740481C1C}">
+                          <a14:useLocalDpi xmlns:a14="http://schemas.microsoft.com/office/drawing/2010/main" val="0"/>
+                        </a:ext>
+                      </a:extLst>
+                    </a:blip>
+                    <a:stretch>
+                      <a:fillRect/>
+                    </a:stretch>
+                  </pic:blipFill>
+                  <pic:spPr>
+                    <a:xfrm>
+                      <a:off x="0" y="0"/>
+                      <a:ext cx="6858000" cy="6416040"/>
+                    </a:xfrm>
+                    <a:prstGeom prst="rect">
+                      <a:avLst/>
+                    </a:prstGeom>
+                  </pic:spPr>
+                </pic:pic>
+              </a:graphicData>
+            </a:graphic>
+          </wp:inline>
+        </w:drawing>
+      </w:r>
+    </w:p>
+    <w:p>
+      <w:r>
+        <w:rPr>
+          <w:noProof/>
+        </w:rPr>
+        <w:lastRenderedPageBreak/>
+        <w:drawing>
+          <wp:inline distT="0" distB="0" distL="0" distR="0" wp14:anchorId="1374BCA8" wp14:editId="10B6BF57">
+            <wp:extent cx="6858000" cy="6894195"/>
+            <wp:effectExtent l="0" t="0" r="0" b="1905"/>
+            <wp:docPr id="6" name="Imagem 6"/>
+            <wp:cNvGraphicFramePr>
+              <a:graphicFrameLocks xmlns:a="http://schemas.openxmlformats.org/drawingml/2006/main" noChangeAspect="1"/>
+            </wp:cNvGraphicFramePr>
+            <a:graphic xmlns:a="http://schemas.openxmlformats.org/drawingml/2006/main">
+              <a:graphicData uri="http://schemas.openxmlformats.org/drawingml/2006/picture">
+                <pic:pic xmlns:pic="http://schemas.openxmlformats.org/drawingml/2006/picture">
+                  <pic:nvPicPr>
+                    <pic:cNvPr id="6" name="Brasileirao_cbf_rodada2_04fev26.jpeg"/>
+                    <pic:cNvPicPr/>
+                  </pic:nvPicPr>
+                  <pic:blipFill>
+                    <a:blip r:embed="rId11">
+                      <a:extLst>
+                        <a:ext uri="{28A0092B-C50C-407E-A947-70E740481C1C}">
+                          <a14:useLocalDpi xmlns:a14="http://schemas.microsoft.com/office/drawing/2010/main" val="0"/>
+                        </a:ext>
+                      </a:extLst>
+                    </a:blip>
+                    <a:stretch>
+                      <a:fillRect/>
+                    </a:stretch>
+                  </pic:blipFill>
+                  <pic:spPr>
+                    <a:xfrm>
+                      <a:off x="0" y="0"/>
+                      <a:ext cx="6858000" cy="6894195"/>
+                    </a:xfrm>
+                    <a:prstGeom prst="rect">
+                      <a:avLst/>
+                    </a:prstGeom>
+                  </pic:spPr>
+                </pic:pic>
+              </a:graphicData>
+            </a:graphic>
+          </wp:inline>
+        </w:drawing>
+      </w:r>
+    </w:p>
+    <w:p/>
+    <w:p/>
+    <w:p>
+      <w:r>
+        <w:t xml:space="preserve">04/02/2026 – </w:t>
+      </w:r>
+      <w:proofErr w:type="spellStart"/>
+      <w:r>
+        <w:t>Rodada</w:t>
+      </w:r>
+      <w:proofErr w:type="spellEnd"/>
+      <w:r>
+        <w:t xml:space="preserve"> 2</w:t>
+      </w:r>
+    </w:p>
+    <w:p>
+      <w:r>
+        <w:rPr>
+          <w:noProof/>
+        </w:rPr>
+        <w:lastRenderedPageBreak/>
+        <w:drawing>
+          <wp:inline distT="0" distB="0" distL="0" distR="0" wp14:anchorId="614BBA58" wp14:editId="2ACBF692">
+            <wp:extent cx="6858000" cy="6243320"/>
+            <wp:effectExtent l="0" t="0" r="0" b="5080"/>
+            <wp:docPr id="7" name="Imagem 7"/>
+            <wp:cNvGraphicFramePr>
+              <a:graphicFrameLocks xmlns:a="http://schemas.openxmlformats.org/drawingml/2006/main" noChangeAspect="1"/>
+            </wp:cNvGraphicFramePr>
+            <a:graphic xmlns:a="http://schemas.openxmlformats.org/drawingml/2006/main">
+              <a:graphicData uri="http://schemas.openxmlformats.org/drawingml/2006/picture">
+                <pic:pic xmlns:pic="http://schemas.openxmlformats.org/drawingml/2006/picture">
+                  <pic:nvPicPr>
+                    <pic:cNvPr id="7" name="WhatsApp Image 2026-02-06 at 07.45.58.jpeg"/>
+                    <pic:cNvPicPr/>
+                  </pic:nvPicPr>
+                  <pic:blipFill>
+                    <a:blip r:embed="rId12">
+                      <a:extLst>
+                        <a:ext uri="{28A0092B-C50C-407E-A947-70E740481C1C}">
+                          <a14:useLocalDpi xmlns:a14="http://schemas.microsoft.com/office/drawing/2010/main" val="0"/>
+                        </a:ext>
+                      </a:extLst>
+                    </a:blip>
+                    <a:stretch>
+                      <a:fillRect/>
+                    </a:stretch>
+                  </pic:blipFill>
+                  <pic:spPr>
+                    <a:xfrm>
+                      <a:off x="0" y="0"/>
+                      <a:ext cx="6858000" cy="6243320"/>
+                    </a:xfrm>
+                    <a:prstGeom prst="rect">
+                      <a:avLst/>
+                    </a:prstGeom>
+                  </pic:spPr>
+                </pic:pic>
+              </a:graphicData>
+            </a:graphic>
+          </wp:inline>
+        </w:drawing>
+      </w:r>
+    </w:p>
+    <w:p>
+      <w:r>
+        <w:rPr>
+          <w:noProof/>
+        </w:rPr>
+        <w:lastRenderedPageBreak/>
+        <w:drawing>
+          <wp:inline distT="0" distB="0" distL="0" distR="0" wp14:anchorId="6E9B287F" wp14:editId="34529F0B">
+            <wp:extent cx="6858000" cy="6922770"/>
+            <wp:effectExtent l="0" t="0" r="0" b="0"/>
+            <wp:docPr id="9" name="Imagem 9"/>
+            <wp:cNvGraphicFramePr>
+              <a:graphicFrameLocks xmlns:a="http://schemas.openxmlformats.org/drawingml/2006/main" noChangeAspect="1"/>
+            </wp:cNvGraphicFramePr>
+            <a:graphic xmlns:a="http://schemas.openxmlformats.org/drawingml/2006/main">
+              <a:graphicData uri="http://schemas.openxmlformats.org/drawingml/2006/picture">
+                <pic:pic xmlns:pic="http://schemas.openxmlformats.org/drawingml/2006/picture">
+                  <pic:nvPicPr>
+                    <pic:cNvPr id="9" name="WhatsApp Image 2026-02-06 at 07.46.52.jpeg"/>
+                    <pic:cNvPicPr/>
+                  </pic:nvPicPr>
+                  <pic:blipFill>
+                    <a:blip r:embed="rId13">
+                      <a:extLst>
+                        <a:ext uri="{28A0092B-C50C-407E-A947-70E740481C1C}">
+                          <a14:useLocalDpi xmlns:a14="http://schemas.microsoft.com/office/drawing/2010/main" val="0"/>
+                        </a:ext>
+                      </a:extLst>
+                    </a:blip>
+                    <a:stretch>
+                      <a:fillRect/>
+                    </a:stretch>
+                  </pic:blipFill>
+                  <pic:spPr>
+                    <a:xfrm>
+                      <a:off x="0" y="0"/>
+                      <a:ext cx="6858000" cy="6922770"/>
+                    </a:xfrm>
+                    <a:prstGeom prst="rect">
+                      <a:avLst/>
+                    </a:prstGeom>
+                  </pic:spPr>
+                </pic:pic>
+              </a:graphicData>
+            </a:graphic>
+          </wp:inline>
+        </w:drawing>
+      </w:r>
+    </w:p>
+    <w:p>
+      <w:r>
+        <w:br w:type="page"/>
+      </w:r>
+    </w:p>
+    <w:p>
+      <w:r>
+        <w:lastRenderedPageBreak/>
+        <w:t xml:space="preserve">10/02/2026 – </w:t>
+      </w:r>
+      <w:proofErr w:type="spellStart"/>
+      <w:r>
+        <w:t>Rodada</w:t>
+      </w:r>
+      <w:proofErr w:type="spellEnd"/>
+      <w:r>
+        <w:t xml:space="preserve"> 3</w:t>
+      </w:r>
+    </w:p>
+    <w:p>
+      <w:r>
+        <w:rPr>
+          <w:noProof/>
+        </w:rPr>
+        <w:drawing>
+          <wp:inline distT="0" distB="0" distL="0" distR="0" wp14:anchorId="318B02C2" wp14:editId="187FC46D">
+            <wp:extent cx="6858000" cy="6767195"/>
+            <wp:effectExtent l="0" t="0" r="0" b="0"/>
+            <wp:docPr id="8" name="Imagem 8"/>
+            <wp:cNvGraphicFramePr>
+              <a:graphicFrameLocks xmlns:a="http://schemas.openxmlformats.org/drawingml/2006/main" noChangeAspect="1"/>
+            </wp:cNvGraphicFramePr>
+            <a:graphic xmlns:a="http://schemas.openxmlformats.org/drawingml/2006/main">
+              <a:graphicData uri="http://schemas.openxmlformats.org/drawingml/2006/picture">
+                <pic:pic xmlns:pic="http://schemas.openxmlformats.org/drawingml/2006/picture">
+                  <pic:nvPicPr>
+                    <pic:cNvPr id="8" name="rodada3_01.jpeg"/>
+                    <pic:cNvPicPr/>
+                  </pic:nvPicPr>
+                  <pic:blipFill>
+                    <a:blip r:embed="rId14">
+                      <a:extLst>
+                        <a:ext uri="{28A0092B-C50C-407E-A947-70E740481C1C}">
+                          <a14:useLocalDpi xmlns:a14="http://schemas.microsoft.com/office/drawing/2010/main" val="0"/>
+                        </a:ext>
+                      </a:extLst>
+                    </a:blip>
+                    <a:stretch>
+                      <a:fillRect/>
+                    </a:stretch>
+                  </pic:blipFill>
+                  <pic:spPr>
+                    <a:xfrm>
+                      <a:off x="0" y="0"/>
+                      <a:ext cx="6858000" cy="6767195"/>
+                    </a:xfrm>
+                    <a:prstGeom prst="rect">
+                      <a:avLst/>
+                    </a:prstGeom>
+                  </pic:spPr>
+                </pic:pic>
+              </a:graphicData>
+            </a:graphic>
+          </wp:inline>
+        </w:drawing>
+      </w:r>
+    </w:p>
+    <w:p>
+      <w:r>
+        <w:rPr>
+          <w:noProof/>
+        </w:rPr>
+        <w:lastRenderedPageBreak/>
+        <w:drawing>
+          <wp:inline distT="0" distB="0" distL="0" distR="0" wp14:anchorId="2C2F5B85" wp14:editId="6FDD1163">
+            <wp:extent cx="6858000" cy="6989445"/>
+            <wp:effectExtent l="0" t="0" r="0" b="1905"/>
+            <wp:docPr id="10" name="Imagem 10"/>
+            <wp:cNvGraphicFramePr>
+              <a:graphicFrameLocks xmlns:a="http://schemas.openxmlformats.org/drawingml/2006/main" noChangeAspect="1"/>
+            </wp:cNvGraphicFramePr>
+            <a:graphic xmlns:a="http://schemas.openxmlformats.org/drawingml/2006/main">
+              <a:graphicData uri="http://schemas.openxmlformats.org/drawingml/2006/picture">
+                <pic:pic xmlns:pic="http://schemas.openxmlformats.org/drawingml/2006/picture">
+                  <pic:nvPicPr>
+                    <pic:cNvPr id="10" name="rodadaCbf3_01.jpeg"/>
+                    <pic:cNvPicPr/>
+                  </pic:nvPicPr>
+                  <pic:blipFill>
+                    <a:blip r:embed="rId15">
+                      <a:extLst>
+                        <a:ext uri="{28A0092B-C50C-407E-A947-70E740481C1C}">
+                          <a14:useLocalDpi xmlns:a14="http://schemas.microsoft.com/office/drawing/2010/main" val="0"/>
+                        </a:ext>
+                      </a:extLst>
+                    </a:blip>
+                    <a:stretch>
+                      <a:fillRect/>
+                    </a:stretch>
+                  </pic:blipFill>
+                  <pic:spPr>
+                    <a:xfrm>
+                      <a:off x="0" y="0"/>
+                      <a:ext cx="6858000" cy="6989445"/>
+                    </a:xfrm>
+                    <a:prstGeom prst="rect">
+                      <a:avLst/>
+                    </a:prstGeom>
+                  </pic:spPr>
+                </pic:pic>
+              </a:graphicData>
+            </a:graphic>
+          </wp:inline>
+        </w:drawing>
+      </w:r>
+    </w:p>
+    <w:p>
+      <w:r>
+        <w:t xml:space="preserve">11/02/2026 – </w:t>
+      </w:r>
+      <w:proofErr w:type="spellStart"/>
+      <w:r>
+        <w:t>Rodada</w:t>
+      </w:r>
+      <w:proofErr w:type="spellEnd"/>
+      <w:r>
+        <w:t xml:space="preserve"> 3</w:t>
+      </w:r>
+    </w:p>
+    <w:p>
+      <w:r>
+        <w:rPr>
+          <w:noProof/>
+        </w:rPr>
+        <w:lastRenderedPageBreak/>
+        <w:drawing>
+          <wp:inline distT="0" distB="0" distL="0" distR="0" wp14:anchorId="3EBF2B6E" wp14:editId="027DBDB7">
+            <wp:extent cx="6858000" cy="6899910"/>
+            <wp:effectExtent l="0" t="0" r="0" b="0"/>
+            <wp:docPr id="11" name="Imagem 11"/>
+            <wp:cNvGraphicFramePr>
+              <a:graphicFrameLocks xmlns:a="http://schemas.openxmlformats.org/drawingml/2006/main" noChangeAspect="1"/>
+            </wp:cNvGraphicFramePr>
+            <a:graphic xmlns:a="http://schemas.openxmlformats.org/drawingml/2006/main">
+              <a:graphicData uri="http://schemas.openxmlformats.org/drawingml/2006/picture">
+                <pic:pic xmlns:pic="http://schemas.openxmlformats.org/drawingml/2006/picture">
+                  <pic:nvPicPr>
+                    <pic:cNvPr id="11" name="rodada3_02.jpeg"/>
+                    <pic:cNvPicPr/>
+                  </pic:nvPicPr>
+                  <pic:blipFill>
+                    <a:blip r:embed="rId16">
+                      <a:extLst>
+                        <a:ext uri="{28A0092B-C50C-407E-A947-70E740481C1C}">
+                          <a14:useLocalDpi xmlns:a14="http://schemas.microsoft.com/office/drawing/2010/main" val="0"/>
+                        </a:ext>
+                      </a:extLst>
+                    </a:blip>
+                    <a:stretch>
+                      <a:fillRect/>
+                    </a:stretch>
+                  </pic:blipFill>
+                  <pic:spPr>
+                    <a:xfrm>
+                      <a:off x="0" y="0"/>
+                      <a:ext cx="6858000" cy="6899910"/>
+                    </a:xfrm>
+                    <a:prstGeom prst="rect">
+                      <a:avLst/>
+                    </a:prstGeom>
+                  </pic:spPr>
+                </pic:pic>
+              </a:graphicData>
+            </a:graphic>
+          </wp:inline>
+        </w:drawing>
+      </w:r>
+    </w:p>
+    <w:p>
+      <w:r>
+        <w:rPr>
+          <w:noProof/>
+        </w:rPr>
+        <w:lastRenderedPageBreak/>
+        <w:drawing>
+          <wp:inline distT="0" distB="0" distL="0" distR="0" wp14:anchorId="0E2CEF11" wp14:editId="2CCC7DF8">
+            <wp:extent cx="6858000" cy="7000875"/>
+            <wp:effectExtent l="0" t="0" r="0" b="9525"/>
+            <wp:docPr id="12" name="Imagem 12"/>
+            <wp:cNvGraphicFramePr>
+              <a:graphicFrameLocks xmlns:a="http://schemas.openxmlformats.org/drawingml/2006/main" noChangeAspect="1"/>
+            </wp:cNvGraphicFramePr>
+            <a:graphic xmlns:a="http://schemas.openxmlformats.org/drawingml/2006/main">
+              <a:graphicData uri="http://schemas.openxmlformats.org/drawingml/2006/picture">
+                <pic:pic xmlns:pic="http://schemas.openxmlformats.org/drawingml/2006/picture">
+                  <pic:nvPicPr>
+                    <pic:cNvPr id="12" name="rodadaCbf3_02.jpeg"/>
+                    <pic:cNvPicPr/>
+                  </pic:nvPicPr>
+                  <pic:blipFill>
+                    <a:blip r:embed="rId17">
+                      <a:extLst>
+                        <a:ext uri="{28A0092B-C50C-407E-A947-70E740481C1C}">
+                          <a14:useLocalDpi xmlns:a14="http://schemas.microsoft.com/office/drawing/2010/main" val="0"/>
+                        </a:ext>
+                      </a:extLst>
+                    </a:blip>
+                    <a:stretch>
+                      <a:fillRect/>
+                    </a:stretch>
+                  </pic:blipFill>
+                  <pic:spPr>
+                    <a:xfrm>
+                      <a:off x="0" y="0"/>
+                      <a:ext cx="6858000" cy="7000875"/>
+                    </a:xfrm>
+                    <a:prstGeom prst="rect">
+                      <a:avLst/>
+                    </a:prstGeom>
+                  </pic:spPr>
+                </pic:pic>
+              </a:graphicData>
+            </a:graphic>
+          </wp:inline>
+        </w:drawing>
+      </w:r>
+    </w:p>
+    <w:p>
+      <w:r>
+        <w:t>1</w:t>
+      </w:r>
+      <w:r>
+        <w:t>2</w:t>
+      </w:r>
+      <w:r>
+        <w:t xml:space="preserve">/02/2026 – </w:t>
+      </w:r>
+      <w:proofErr w:type="spellStart"/>
+      <w:r>
+        <w:t>Rodada</w:t>
+      </w:r>
+      <w:proofErr w:type="spellEnd"/>
+      <w:r>
+        <w:t xml:space="preserve"> 3</w:t>
+      </w:r>
+    </w:p>
+    <w:p>
+      <w:r>
+        <w:rPr>
+          <w:noProof/>
+        </w:rPr>
+        <w:lastRenderedPageBreak/>
+        <w:drawing>
+          <wp:inline distT="0" distB="0" distL="0" distR="0" wp14:anchorId="4555852E" wp14:editId="24A431AE">
+            <wp:extent cx="6858000" cy="6390005"/>
+            <wp:effectExtent l="0" t="0" r="0" b="0"/>
+            <wp:docPr id="13" name="Imagem 13"/>
+            <wp:cNvGraphicFramePr>
+              <a:graphicFrameLocks xmlns:a="http://schemas.openxmlformats.org/drawingml/2006/main" noChangeAspect="1"/>
+            </wp:cNvGraphicFramePr>
+            <a:graphic xmlns:a="http://schemas.openxmlformats.org/drawingml/2006/main">
+              <a:graphicData uri="http://schemas.openxmlformats.org/drawingml/2006/picture">
+                <pic:pic xmlns:pic="http://schemas.openxmlformats.org/drawingml/2006/picture">
+                  <pic:nvPicPr>
+                    <pic:cNvPr id="13" name="rodada3_03.jpeg"/>
+                    <pic:cNvPicPr/>
+                  </pic:nvPicPr>
+                  <pic:blipFill>
+                    <a:blip r:embed="rId18">
+                      <a:extLst>
+                        <a:ext uri="{28A0092B-C50C-407E-A947-70E740481C1C}">
+                          <a14:useLocalDpi xmlns:a14="http://schemas.microsoft.com/office/drawing/2010/main" val="0"/>
+                        </a:ext>
+                      </a:extLst>
+                    </a:blip>
+                    <a:stretch>
+                      <a:fillRect/>
+                    </a:stretch>
+                  </pic:blipFill>
+                  <pic:spPr>
+                    <a:xfrm>
+                      <a:off x="0" y="0"/>
+                      <a:ext cx="6858000" cy="6390005"/>
+                    </a:xfrm>
+                    <a:prstGeom prst="rect">
+                      <a:avLst/>
+                    </a:prstGeom>
+                  </pic:spPr>
+                </pic:pic>
+              </a:graphicData>
+            </a:graphic>
+          </wp:inline>
+        </w:drawing>
+      </w:r>
+    </w:p>
+    <w:p>
+      <w:bookmarkStart w:id="0" w:name="_GoBack"/>
+      <w:r>
+        <w:rPr>
+          <w:noProof/>
+        </w:rPr>
+        <w:lastRenderedPageBreak/>
+        <w:drawing>
+          <wp:inline distT="0" distB="0" distL="0" distR="0" wp14:anchorId="66A535C0" wp14:editId="6AC1C182">
+            <wp:extent cx="6858000" cy="7402830"/>
+            <wp:effectExtent l="0" t="0" r="0" b="7620"/>
+            <wp:docPr id="14" name="Imagem 14" descr="Uma imagem contendo Tabela&#10;&#10;Descrição gerada automaticamente"/>
+            <wp:cNvGraphicFramePr>
+              <a:graphicFrameLocks xmlns:a="http://schemas.openxmlformats.org/drawingml/2006/main" noChangeAspect="1"/>
+            </wp:cNvGraphicFramePr>
+            <a:graphic xmlns:a="http://schemas.openxmlformats.org/drawingml/2006/main">
+              <a:graphicData uri="http://schemas.openxmlformats.org/drawingml/2006/picture">
+                <pic:pic xmlns:pic="http://schemas.openxmlformats.org/drawingml/2006/picture">
+                  <pic:nvPicPr>
+                    <pic:cNvPr id="14" name="rodadaCbf3_03.jpeg"/>
+                    <pic:cNvPicPr/>
+                  </pic:nvPicPr>
+                  <pic:blipFill>
+                    <a:blip r:embed="rId19">
+                      <a:extLst>
+                        <a:ext uri="{28A0092B-C50C-407E-A947-70E740481C1C}">
+                          <a14:useLocalDpi xmlns:a14="http://schemas.microsoft.com/office/drawing/2010/main" val="0"/>
+                        </a:ext>
+                      </a:extLst>
+                    </a:blip>
+                    <a:stretch>
+                      <a:fillRect/>
+                    </a:stretch>
+                  </pic:blipFill>
+                  <pic:spPr>
+                    <a:xfrm>
+                      <a:off x="0" y="0"/>
+                      <a:ext cx="6858000" cy="7402830"/>
+                    </a:xfrm>
+                    <a:prstGeom prst="rect">
+                      <a:avLst/>
+                    </a:prstGeom>
+                  </pic:spPr>
+                </pic:pic>
+              </a:graphicData>
+            </a:graphic>
+          </wp:inline>
+        </w:drawing>
+      </w:r>
+      <w:bookmarkEnd w:id="0"/>
+    </w:p>
+    <w:p/>
     <w:sectPr>
-      <w:headerReference w:type="default" r:id="rId10"/>
+      <w:headerReference w:type="default" r:id="rId20"/>
       <w:pgSz w:w="12240" w:h="15840"/>
       <w:pgMar w:top="720" w:right="720" w:bottom="720" w:left="720" w:header="708" w:footer="708" w:gutter="0"/>
       <w:cols w:space="708"/>

</xml_diff>

<commit_message>
Ajuste para incluir comentarios via ChatGPT
</commit_message>
<xml_diff>
--- a/Rodadas e Classificação Brasileirão Série A 2026.docx
+++ b/Rodadas e Classificação Brasileirão Série A 2026.docx
@@ -694,13 +694,7 @@
     </w:p>
     <w:p>
       <w:r>
-        <w:t>1</w:t>
-      </w:r>
-      <w:r>
-        <w:t>2</w:t>
-      </w:r>
-      <w:r>
-        <w:t xml:space="preserve">/02/2026 – </w:t>
+        <w:t xml:space="preserve">12/02/2026 – </w:t>
       </w:r>
       <w:proofErr w:type="spellStart"/>
       <w:r>
@@ -761,7 +755,13 @@
       </w:r>
     </w:p>
     <w:p>
-      <w:bookmarkStart w:id="0" w:name="_GoBack"/>
+      <w:pPr>
+        <w:rPr>
+          <w:lang w:val="pt-BR"/>
+        </w:rPr>
+      </w:pPr>
+    </w:p>
+    <w:p>
       <w:r>
         <w:rPr>
           <w:noProof/>
@@ -809,11 +809,187 @@
           </wp:inline>
         </w:drawing>
       </w:r>
+    </w:p>
+    <w:p>
+      <w:pPr>
+        <w:rPr>
+          <w:lang w:val="pt-BR"/>
+        </w:rPr>
+      </w:pPr>
+      <w:r>
+        <w:rPr>
+          <w:lang w:val="pt-BR"/>
+        </w:rPr>
+        <w:t>Rodada 2 – 19/02/2026 – Jogo atrasado CAP x</w:t>
+      </w:r>
+      <w:r>
+        <w:rPr>
+          <w:lang w:val="pt-BR"/>
+        </w:rPr>
+        <w:t xml:space="preserve"> COR</w:t>
+      </w:r>
+    </w:p>
+    <w:p>
+      <w:pPr>
+        <w:rPr>
+          <w:lang w:val="pt-BR"/>
+        </w:rPr>
+      </w:pPr>
+      <w:r>
+        <w:rPr>
+          <w:noProof/>
+          <w:lang w:val="pt-BR"/>
+        </w:rPr>
+        <w:lastRenderedPageBreak/>
+        <w:drawing>
+          <wp:inline distT="0" distB="0" distL="0" distR="0" wp14:anchorId="2DFE229D" wp14:editId="6A57BDAE">
+            <wp:extent cx="5347335" cy="9144000"/>
+            <wp:effectExtent l="0" t="0" r="5715" b="0"/>
+            <wp:docPr id="16" name="Imagem 16"/>
+            <wp:cNvGraphicFramePr>
+              <a:graphicFrameLocks xmlns:a="http://schemas.openxmlformats.org/drawingml/2006/main" noChangeAspect="1"/>
+            </wp:cNvGraphicFramePr>
+            <a:graphic xmlns:a="http://schemas.openxmlformats.org/drawingml/2006/main">
+              <a:graphicData uri="http://schemas.openxmlformats.org/drawingml/2006/picture">
+                <pic:pic xmlns:pic="http://schemas.openxmlformats.org/drawingml/2006/picture">
+                  <pic:nvPicPr>
+                    <pic:cNvPr id="16" name="rodada2_JogoCAPxCOR.jpeg"/>
+                    <pic:cNvPicPr/>
+                  </pic:nvPicPr>
+                  <pic:blipFill>
+                    <a:blip r:embed="rId20">
+                      <a:extLst>
+                        <a:ext uri="{28A0092B-C50C-407E-A947-70E740481C1C}">
+                          <a14:useLocalDpi xmlns:a14="http://schemas.microsoft.com/office/drawing/2010/main" val="0"/>
+                        </a:ext>
+                      </a:extLst>
+                    </a:blip>
+                    <a:stretch>
+                      <a:fillRect/>
+                    </a:stretch>
+                  </pic:blipFill>
+                  <pic:spPr>
+                    <a:xfrm>
+                      <a:off x="0" y="0"/>
+                      <a:ext cx="5347335" cy="9144000"/>
+                    </a:xfrm>
+                    <a:prstGeom prst="rect">
+                      <a:avLst/>
+                    </a:prstGeom>
+                  </pic:spPr>
+                </pic:pic>
+              </a:graphicData>
+            </a:graphic>
+          </wp:inline>
+        </w:drawing>
+      </w:r>
+    </w:p>
+    <w:p>
+      <w:pPr>
+        <w:rPr>
+          <w:lang w:val="pt-BR"/>
+        </w:rPr>
+      </w:pPr>
+      <w:r>
+        <w:rPr>
+          <w:lang w:val="pt-BR"/>
+        </w:rPr>
+        <w:lastRenderedPageBreak/>
+        <w:drawing>
+          <wp:inline distT="0" distB="0" distL="0" distR="0" wp14:anchorId="755F9C67" wp14:editId="7000158C">
+            <wp:extent cx="3010161" cy="586791"/>
+            <wp:effectExtent l="0" t="0" r="0" b="3810"/>
+            <wp:docPr id="17" name="Imagem 17"/>
+            <wp:cNvGraphicFramePr>
+              <a:graphicFrameLocks xmlns:a="http://schemas.openxmlformats.org/drawingml/2006/main" noChangeAspect="1"/>
+            </wp:cNvGraphicFramePr>
+            <a:graphic xmlns:a="http://schemas.openxmlformats.org/drawingml/2006/main">
+              <a:graphicData uri="http://schemas.openxmlformats.org/drawingml/2006/picture">
+                <pic:pic xmlns:pic="http://schemas.openxmlformats.org/drawingml/2006/picture">
+                  <pic:nvPicPr>
+                    <pic:cNvPr id="1" name=""/>
+                    <pic:cNvPicPr/>
+                  </pic:nvPicPr>
+                  <pic:blipFill>
+                    <a:blip r:embed="rId21"/>
+                    <a:stretch>
+                      <a:fillRect/>
+                    </a:stretch>
+                  </pic:blipFill>
+                  <pic:spPr>
+                    <a:xfrm>
+                      <a:off x="0" y="0"/>
+                      <a:ext cx="3010161" cy="586791"/>
+                    </a:xfrm>
+                    <a:prstGeom prst="rect">
+                      <a:avLst/>
+                    </a:prstGeom>
+                  </pic:spPr>
+                </pic:pic>
+              </a:graphicData>
+            </a:graphic>
+          </wp:inline>
+        </w:drawing>
+      </w:r>
+    </w:p>
+    <w:p>
+      <w:pPr>
+        <w:rPr>
+          <w:lang w:val="pt-BR"/>
+        </w:rPr>
+      </w:pPr>
+      <w:bookmarkStart w:id="0" w:name="_GoBack"/>
+      <w:r>
+        <w:rPr>
+          <w:noProof/>
+          <w:lang w:val="pt-BR"/>
+        </w:rPr>
+        <w:drawing>
+          <wp:inline distT="0" distB="0" distL="0" distR="0" wp14:anchorId="6F031EB8" wp14:editId="2C838FAB">
+            <wp:extent cx="6858000" cy="7030720"/>
+            <wp:effectExtent l="0" t="0" r="0" b="0"/>
+            <wp:docPr id="18" name="Imagem 18"/>
+            <wp:cNvGraphicFramePr>
+              <a:graphicFrameLocks xmlns:a="http://schemas.openxmlformats.org/drawingml/2006/main" noChangeAspect="1"/>
+            </wp:cNvGraphicFramePr>
+            <a:graphic xmlns:a="http://schemas.openxmlformats.org/drawingml/2006/main">
+              <a:graphicData uri="http://schemas.openxmlformats.org/drawingml/2006/picture">
+                <pic:pic xmlns:pic="http://schemas.openxmlformats.org/drawingml/2006/picture">
+                  <pic:nvPicPr>
+                    <pic:cNvPr id="18" name="rodadaCbf3_JogoCAPxCOR.jpeg"/>
+                    <pic:cNvPicPr/>
+                  </pic:nvPicPr>
+                  <pic:blipFill>
+                    <a:blip r:embed="rId22">
+                      <a:extLst>
+                        <a:ext uri="{28A0092B-C50C-407E-A947-70E740481C1C}">
+                          <a14:useLocalDpi xmlns:a14="http://schemas.microsoft.com/office/drawing/2010/main" val="0"/>
+                        </a:ext>
+                      </a:extLst>
+                    </a:blip>
+                    <a:stretch>
+                      <a:fillRect/>
+                    </a:stretch>
+                  </pic:blipFill>
+                  <pic:spPr>
+                    <a:xfrm>
+                      <a:off x="0" y="0"/>
+                      <a:ext cx="6858000" cy="7030720"/>
+                    </a:xfrm>
+                    <a:prstGeom prst="rect">
+                      <a:avLst/>
+                    </a:prstGeom>
+                  </pic:spPr>
+                </pic:pic>
+              </a:graphicData>
+            </a:graphic>
+          </wp:inline>
+        </w:drawing>
+      </w:r>
       <w:bookmarkEnd w:id="0"/>
     </w:p>
-    <w:p/>
     <w:sectPr>
-      <w:headerReference w:type="default" r:id="rId20"/>
+      <w:headerReference w:type="default" r:id="rId23"/>
       <w:pgSz w:w="12240" w:h="15840"/>
       <w:pgMar w:top="720" w:right="720" w:bottom="720" w:left="720" w:header="708" w:footer="708" w:gutter="0"/>
       <w:cols w:space="708"/>

</xml_diff>